<commit_message>
Adcionar modificações na documentação
</commit_message>
<xml_diff>
--- a/DocumentaçãoTCC1.docx
+++ b/DocumentaçãoTCC1.docx
@@ -1,6 +1,6 @@
 
 <file path=word/document.xml><?xml version="1.0" encoding="utf-8"?>
-<w:document xmlns:wpc="http://schemas.microsoft.com/office/word/2010/wordprocessingCanvas" xmlns:cx="http://schemas.microsoft.com/office/drawing/2014/chartex" xmlns:cx1="http://schemas.microsoft.com/office/drawing/2015/9/8/chartex" xmlns:cx2="http://schemas.microsoft.com/office/drawing/2015/10/21/chartex" xmlns:cx3="http://schemas.microsoft.com/office/drawing/2016/5/9/chartex" xmlns:cx4="http://schemas.microsoft.com/office/drawing/2016/5/10/chartex" xmlns:cx5="http://schemas.microsoft.com/office/drawing/2016/5/11/chartex" xmlns:cx6="http://schemas.microsoft.com/office/drawing/2016/5/12/chartex" xmlns:cx7="http://schemas.microsoft.com/office/drawing/2016/5/13/chartex" xmlns:cx8="http://schemas.microsoft.com/office/drawing/2016/5/14/chartex" xmlns:mc="http://schemas.openxmlformats.org/markup-compatibility/2006" xmlns:aink="http://schemas.microsoft.com/office/drawing/2016/ink" xmlns:am3d="http://schemas.microsoft.com/office/drawing/2017/model3d" xmlns:o="urn:schemas-microsoft-com:office:office" xmlns:oel="http://schemas.microsoft.com/office/2019/extlst" xmlns:r="http://schemas.openxmlformats.org/officeDocument/2006/relationships" xmlns:m="http://schemas.openxmlformats.org/officeDocument/2006/math" xmlns:v="urn:schemas-microsoft-com:vml" xmlns:wp14="http://schemas.microsoft.com/office/word/2010/wordprocessingDrawing" xmlns:wp="http://schemas.openxmlformats.org/drawingml/2006/wordprocessingDrawing" xmlns:w10="urn:schemas-microsoft-com:office:word" xmlns:w="http://schemas.openxmlformats.org/wordprocessingml/2006/main" xmlns:w14="http://schemas.microsoft.com/office/word/2010/wordml" xmlns:w15="http://schemas.microsoft.com/office/word/2012/wordml" xmlns:w16cex="http://schemas.microsoft.com/office/word/2018/wordml/cex" xmlns:w16cid="http://schemas.microsoft.com/office/word/2016/wordml/cid" xmlns:w16="http://schemas.microsoft.com/office/word/2018/wordml" xmlns:w16du="http://schemas.microsoft.com/office/word/2023/wordml/word16du" xmlns:w16sdtdh="http://schemas.microsoft.com/office/word/2020/wordml/sdtdatahash" xmlns:w16sdtfl="http://schemas.microsoft.com/office/word/2024/wordml/sdtformatlock" xmlns:w16se="http://schemas.microsoft.com/office/word/2015/wordml/symex" xmlns:wpg="http://schemas.microsoft.com/office/word/2010/wordprocessingGroup" xmlns:wpi="http://schemas.microsoft.com/office/word/2010/wordprocessingInk" xmlns:wne="http://schemas.microsoft.com/office/word/2006/wordml" xmlns:wps="http://schemas.microsoft.com/office/word/2010/wordprocessingShape" mc:Ignorable="w14 w15 w16se w16cid w16 w16cex w16sdtdh w16sdtfl w16du wp14">
+<w:document xmlns:wpc="http://schemas.microsoft.com/office/word/2010/wordprocessingCanvas" xmlns:cx="http://schemas.microsoft.com/office/drawing/2014/chartex" xmlns:cx1="http://schemas.microsoft.com/office/drawing/2015/9/8/chartex" xmlns:cx2="http://schemas.microsoft.com/office/drawing/2015/10/21/chartex" xmlns:cx3="http://schemas.microsoft.com/office/drawing/2016/5/9/chartex" xmlns:cx4="http://schemas.microsoft.com/office/drawing/2016/5/10/chartex" xmlns:cx5="http://schemas.microsoft.com/office/drawing/2016/5/11/chartex" xmlns:cx6="http://schemas.microsoft.com/office/drawing/2016/5/12/chartex" xmlns:cx7="http://schemas.microsoft.com/office/drawing/2016/5/13/chartex" xmlns:cx8="http://schemas.microsoft.com/office/drawing/2016/5/14/chartex" xmlns:mc="http://schemas.openxmlformats.org/markup-compatibility/2006" xmlns:aink="http://schemas.microsoft.com/office/drawing/2016/ink" xmlns:am3d="http://schemas.microsoft.com/office/drawing/2017/model3d" xmlns:o="urn:schemas-microsoft-com:office:office" xmlns:r="http://schemas.openxmlformats.org/officeDocument/2006/relationships" xmlns:m="http://schemas.openxmlformats.org/officeDocument/2006/math" xmlns:v="urn:schemas-microsoft-com:vml" xmlns:wp14="http://schemas.microsoft.com/office/word/2010/wordprocessingDrawing" xmlns:wp="http://schemas.openxmlformats.org/drawingml/2006/wordprocessingDrawing" xmlns:w10="urn:schemas-microsoft-com:office:word" xmlns:w="http://schemas.openxmlformats.org/wordprocessingml/2006/main" xmlns:w14="http://schemas.microsoft.com/office/word/2010/wordml" xmlns:w15="http://schemas.microsoft.com/office/word/2012/wordml" xmlns:w16cid="http://schemas.microsoft.com/office/word/2016/wordml/cid" xmlns:w16se="http://schemas.microsoft.com/office/word/2015/wordml/symex" xmlns:wpg="http://schemas.microsoft.com/office/word/2010/wordprocessingGroup" xmlns:wpi="http://schemas.microsoft.com/office/word/2010/wordprocessingInk" xmlns:wne="http://schemas.microsoft.com/office/word/2006/wordml" xmlns:wps="http://schemas.microsoft.com/office/word/2010/wordprocessingShape" mc:Ignorable="w14 w15 w16se w16cid wp14">
   <w:body>
     <w:p>
       <w:pPr>
@@ -2198,28 +2198,155 @@
           <w:szCs w:val="24"/>
         </w:rPr>
       </w:pPr>
-    </w:p>
-    <w:p>
-      <w:pPr>
-        <w:spacing w:after="0" w:line="360" w:lineRule="auto"/>
-        <w:jc w:val="center"/>
-        <w:rPr>
-          <w:rFonts w:ascii="Arial" w:hAnsi="Arial" w:cs="Arial"/>
-          <w:sz w:val="24"/>
-          <w:szCs w:val="24"/>
-        </w:rPr>
-      </w:pPr>
-    </w:p>
-    <w:p>
-      <w:pPr>
-        <w:spacing w:after="0" w:line="360" w:lineRule="auto"/>
-        <w:jc w:val="center"/>
-        <w:rPr>
-          <w:rFonts w:ascii="Arial" w:hAnsi="Arial" w:cs="Arial"/>
-          <w:sz w:val="24"/>
-          <w:szCs w:val="24"/>
-        </w:rPr>
-      </w:pPr>
+      <w:bookmarkStart w:id="0" w:name="_GoBack"/>
+      <w:bookmarkEnd w:id="0"/>
+    </w:p>
+    <w:p>
+      <w:pPr>
+        <w:spacing w:after="0" w:line="360" w:lineRule="auto"/>
+        <w:jc w:val="center"/>
+        <w:rPr>
+          <w:rFonts w:ascii="Arial" w:hAnsi="Arial" w:cs="Arial"/>
+          <w:sz w:val="24"/>
+          <w:szCs w:val="24"/>
+        </w:rPr>
+      </w:pPr>
+    </w:p>
+    <w:p>
+      <w:pPr>
+        <w:spacing w:after="0" w:line="360" w:lineRule="auto"/>
+        <w:jc w:val="center"/>
+        <w:rPr>
+          <w:rFonts w:ascii="Arial" w:hAnsi="Arial" w:cs="Arial"/>
+          <w:sz w:val="24"/>
+          <w:szCs w:val="24"/>
+        </w:rPr>
+      </w:pPr>
+    </w:p>
+    <w:p>
+      <w:pPr>
+        <w:pStyle w:val="Ttulo2"/>
+        <w:rPr>
+          <w:rFonts w:ascii="Arial" w:hAnsi="Arial" w:cs="Arial"/>
+          <w:b/>
+          <w:color w:val="000000" w:themeColor="text1"/>
+          <w:sz w:val="28"/>
+          <w:szCs w:val="28"/>
+        </w:rPr>
+      </w:pPr>
+      <w:r>
+        <w:rPr>
+          <w:rFonts w:ascii="Arial" w:hAnsi="Arial" w:cs="Arial"/>
+          <w:b/>
+          <w:color w:val="000000" w:themeColor="text1"/>
+          <w:sz w:val="28"/>
+          <w:szCs w:val="28"/>
+        </w:rPr>
+        <w:t>1 INTRODUÇÃO</w:t>
+      </w:r>
+    </w:p>
+    <w:p>
+      <w:pPr>
+        <w:pStyle w:val="NormalWeb"/>
+        <w:rPr>
+          <w:rFonts w:ascii="Arial" w:hAnsi="Arial" w:cs="Arial"/>
+          <w:color w:val="000000" w:themeColor="text1"/>
+        </w:rPr>
+      </w:pPr>
+      <w:r>
+        <w:rPr>
+          <w:rFonts w:ascii="Arial" w:hAnsi="Arial" w:cs="Arial"/>
+          <w:color w:val="000000" w:themeColor="text1"/>
+        </w:rPr>
+        <w:t>A comunidade escolar é formada por diferentes pessoas que compartilham o mesmo ambiente e possuem necessidades, interesses e experiências distintas. Nesse contexto, a utilização de uma plataforma digital pode contribuir para aproximar seus integrantes, facilitar a comunicação e criar um espaço para o compartilhamento de informações, sugestões e oportunidades.</w:t>
+      </w:r>
+    </w:p>
+    <w:p>
+      <w:pPr>
+        <w:pStyle w:val="NormalWeb"/>
+        <w:rPr>
+          <w:rFonts w:ascii="Arial" w:hAnsi="Arial" w:cs="Arial"/>
+          <w:color w:val="000000" w:themeColor="text1"/>
+        </w:rPr>
+      </w:pPr>
+      <w:r>
+        <w:rPr>
+          <w:rFonts w:ascii="Arial" w:hAnsi="Arial" w:cs="Arial"/>
+          <w:color w:val="000000" w:themeColor="text1"/>
+        </w:rPr>
+        <w:t xml:space="preserve">Pensando nessa necessidade, surgiu o </w:t>
+      </w:r>
+      <w:r>
+        <w:rPr>
+          <w:rStyle w:val="Forte"/>
+          <w:rFonts w:ascii="Arial" w:hAnsi="Arial" w:cs="Arial"/>
+          <w:color w:val="000000" w:themeColor="text1"/>
+        </w:rPr>
+        <w:t>Ei Camargo</w:t>
+      </w:r>
+      <w:r>
+        <w:rPr>
+          <w:rFonts w:ascii="Arial" w:hAnsi="Arial" w:cs="Arial"/>
+          <w:color w:val="000000" w:themeColor="text1"/>
+        </w:rPr>
+        <w:t>, uma plataforma desenvolvida para promover maior integração entre os membros da comunidade da ETEC Professor Camargo Aranha. A proposta busca reunir, em um único ambiente, diferentes formas de interação, permitindo a comunicação entre os usuários, o envio de sugestões, a divulgação de informações e a realização de vendas e outras atividades de interesse da comunidade escolar.</w:t>
+      </w:r>
+    </w:p>
+    <w:p>
+      <w:pPr>
+        <w:pStyle w:val="NormalWeb"/>
+        <w:rPr>
+          <w:rFonts w:ascii="Arial" w:hAnsi="Arial" w:cs="Arial"/>
+          <w:color w:val="000000" w:themeColor="text1"/>
+        </w:rPr>
+      </w:pPr>
+      <w:r>
+        <w:rPr>
+          <w:rFonts w:ascii="Arial" w:hAnsi="Arial" w:cs="Arial"/>
+          <w:color w:val="000000" w:themeColor="text1"/>
+        </w:rPr>
+        <w:t xml:space="preserve">Além de possibilitar a participação dos usuários na identificação de problemas e na apresentação de melhorias para a instituição, a plataforma busca oferecer um </w:t>
+      </w:r>
+      <w:r>
+        <w:rPr>
+          <w:rFonts w:ascii="Arial" w:hAnsi="Arial" w:cs="Arial"/>
+          <w:color w:val="000000" w:themeColor="text1"/>
+        </w:rPr>
+        <w:lastRenderedPageBreak/>
+        <w:t>espaço organizado para divulgação de produtos e oportunidades, fortalecendo a interação entre os membros da comunidade. Dessa maneira, o sistema não se limita à comunicação entre alunos e gestão, mas busca atender diferentes necessidades presentes no ambiente escolar.</w:t>
+      </w:r>
+    </w:p>
+    <w:p>
+      <w:pPr>
+        <w:pStyle w:val="NormalWeb"/>
+        <w:rPr>
+          <w:rFonts w:ascii="Arial" w:hAnsi="Arial" w:cs="Arial"/>
+          <w:color w:val="000000" w:themeColor="text1"/>
+        </w:rPr>
+      </w:pPr>
+      <w:r>
+        <w:rPr>
+          <w:rFonts w:ascii="Arial" w:hAnsi="Arial" w:cs="Arial"/>
+          <w:color w:val="000000" w:themeColor="text1"/>
+        </w:rPr>
+        <w:t xml:space="preserve">Para o desenvolvimento do projeto, foram </w:t>
+      </w:r>
+      <w:proofErr w:type="gramStart"/>
+      <w:r>
+        <w:rPr>
+          <w:rFonts w:ascii="Arial" w:hAnsi="Arial" w:cs="Arial"/>
+          <w:color w:val="000000" w:themeColor="text1"/>
+        </w:rPr>
+        <w:t>utilizadas</w:t>
+      </w:r>
+      <w:proofErr w:type="gramEnd"/>
+      <w:r>
+        <w:rPr>
+          <w:rFonts w:ascii="Arial" w:hAnsi="Arial" w:cs="Arial"/>
+          <w:color w:val="000000" w:themeColor="text1"/>
+        </w:rPr>
+        <w:t xml:space="preserve"> pesquisas e levantamentos com integrantes da comunidade escolar, desenvolvimento Web e modelagem de sistemas utilizando UML. A partir dessas etapas, foi estruturada uma solução digital que reúne diferentes funcionalidades em um único ambiente, buscando tornar a comunicação, a participação e o compartilhamento de informações mais acessíveis e organizados.</w:t>
+      </w:r>
     </w:p>
     <w:p>
       <w:pPr>
@@ -2232,26 +2359,6 @@
           <w:szCs w:val="24"/>
         </w:rPr>
       </w:pPr>
-      <w:r>
-        <w:rPr>
-          <w:rFonts w:ascii="Arial" w:hAnsi="Arial" w:cs="Arial"/>
-          <w:b/>
-          <w:sz w:val="32"/>
-          <w:szCs w:val="24"/>
-        </w:rPr>
-        <w:t>INTRODUÇÃO</w:t>
-      </w:r>
-    </w:p>
-    <w:p>
-      <w:pPr>
-        <w:spacing w:after="0" w:line="360" w:lineRule="auto"/>
-        <w:jc w:val="center"/>
-        <w:rPr>
-          <w:rFonts w:ascii="Arial" w:hAnsi="Arial" w:cs="Arial"/>
-          <w:sz w:val="24"/>
-          <w:szCs w:val="24"/>
-        </w:rPr>
-      </w:pPr>
     </w:p>
     <w:p>
       <w:pPr>
@@ -2261,6 +2368,127 @@
           <w:rFonts w:ascii="Arial" w:hAnsi="Arial" w:cs="Arial"/>
           <w:b/>
           <w:sz w:val="28"/>
+          <w:szCs w:val="28"/>
+        </w:rPr>
+      </w:pPr>
+    </w:p>
+    <w:p>
+      <w:pPr>
+        <w:pStyle w:val="Ttulo2"/>
+        <w:rPr>
+          <w:rFonts w:ascii="Arial" w:hAnsi="Arial" w:cs="Arial"/>
+          <w:b/>
+          <w:color w:val="000000" w:themeColor="text1"/>
+          <w:sz w:val="28"/>
+          <w:szCs w:val="28"/>
+        </w:rPr>
+      </w:pPr>
+      <w:r>
+        <w:rPr>
+          <w:rFonts w:ascii="Arial" w:hAnsi="Arial" w:cs="Arial"/>
+          <w:b/>
+          <w:color w:val="000000" w:themeColor="text1"/>
+          <w:sz w:val="28"/>
+          <w:szCs w:val="28"/>
+        </w:rPr>
+        <w:t>1.1 Problema e contextualização</w:t>
+      </w:r>
+    </w:p>
+    <w:p>
+      <w:pPr>
+        <w:pStyle w:val="NormalWeb"/>
+        <w:rPr>
+          <w:rFonts w:ascii="Arial" w:hAnsi="Arial" w:cs="Arial"/>
+          <w:color w:val="000000" w:themeColor="text1"/>
+        </w:rPr>
+      </w:pPr>
+      <w:r>
+        <w:rPr>
+          <w:rFonts w:ascii="Arial" w:hAnsi="Arial" w:cs="Arial"/>
+          <w:color w:val="000000" w:themeColor="text1"/>
+        </w:rPr>
+        <w:t>A comunidade escolar é composta por alunos, professores, coordenadores e demais integrantes que participam diariamente da rotina da instituição. Nesse ambiente, existe a necessidade de facilitar a comunicação, o compartilhamento de informações e a participação dos diferentes membros da comunidade em atividades e iniciativas escolares.</w:t>
+      </w:r>
+    </w:p>
+    <w:p>
+      <w:pPr>
+        <w:pStyle w:val="NormalWeb"/>
+        <w:rPr>
+          <w:rFonts w:ascii="Arial" w:hAnsi="Arial" w:cs="Arial"/>
+          <w:color w:val="000000" w:themeColor="text1"/>
+        </w:rPr>
+      </w:pPr>
+      <w:r>
+        <w:rPr>
+          <w:rFonts w:ascii="Arial" w:hAnsi="Arial" w:cs="Arial"/>
+          <w:color w:val="000000" w:themeColor="text1"/>
+        </w:rPr>
+        <w:t xml:space="preserve">Durante a observação da rotina da ETEC Professor Camargo Aranha, foram identificadas situações que demonstram dificuldades nesse processo, como problemas relacionados à infraestrutura, sugestões de melhorias, divulgação de informações e comunicação entre os integrantes da instituição. Entre os problemas observados estão a falta ou existência de cadeiras quebradas, necessidades de manutenção em ambientes escolares e dificuldades para encaminhar sugestões e propostas de melhoria. Atualmente, parte dessas demandas é comunicada de maneira informal, o que pode dificultar seu registro e acompanhamento. </w:t>
+      </w:r>
+    </w:p>
+    <w:p>
+      <w:pPr>
+        <w:pStyle w:val="NormalWeb"/>
+        <w:rPr>
+          <w:rFonts w:ascii="Arial" w:hAnsi="Arial" w:cs="Arial"/>
+          <w:color w:val="000000" w:themeColor="text1"/>
+        </w:rPr>
+      </w:pPr>
+      <w:r>
+        <w:rPr>
+          <w:rFonts w:ascii="Arial" w:hAnsi="Arial" w:cs="Arial"/>
+          <w:color w:val="000000" w:themeColor="text1"/>
+        </w:rPr>
+        <w:t>Além dessas necessidades, percebe-se a importância de um espaço que possibilite maior interação entre os integrantes da comunidade escolar, permitindo não apenas o envio de sugestões e comunicação de demandas, mas também a divulgação de informações, produtos e oportunidades de interesse da comunidade.</w:t>
+      </w:r>
+    </w:p>
+    <w:p>
+      <w:pPr>
+        <w:pStyle w:val="NormalWeb"/>
+        <w:rPr>
+          <w:rFonts w:ascii="Arial" w:hAnsi="Arial" w:cs="Arial"/>
+          <w:color w:val="000000" w:themeColor="text1"/>
+        </w:rPr>
+      </w:pPr>
+      <w:r>
+        <w:rPr>
+          <w:rFonts w:ascii="Arial" w:hAnsi="Arial" w:cs="Arial"/>
+          <w:color w:val="000000" w:themeColor="text1"/>
+        </w:rPr>
+        <w:t xml:space="preserve">Diante desse cenário, surge a necessidade de uma plataforma digital capaz de reunir diferentes formas de interação em um único ambiente. Assim, o </w:t>
+      </w:r>
+      <w:r>
+        <w:rPr>
+          <w:rStyle w:val="Forte"/>
+          <w:rFonts w:ascii="Arial" w:hAnsi="Arial" w:cs="Arial"/>
+          <w:color w:val="000000" w:themeColor="text1"/>
+        </w:rPr>
+        <w:t>Ei Camargo</w:t>
+      </w:r>
+      <w:r>
+        <w:rPr>
+          <w:rFonts w:ascii="Arial" w:hAnsi="Arial" w:cs="Arial"/>
+          <w:color w:val="000000" w:themeColor="text1"/>
+        </w:rPr>
+        <w:t xml:space="preserve"> é proposto como uma solução voltada à integração da comunidade da ETEC Professor Camargo Aranha, possibilitando recursos relacionados à comunicação, sugestões, divulgação e vendas.</w:t>
+      </w:r>
+    </w:p>
+    <w:p>
+      <w:pPr>
+        <w:jc w:val="both"/>
+        <w:rPr>
+          <w:rFonts w:ascii="Arial" w:hAnsi="Arial" w:cs="Arial"/>
+          <w:sz w:val="24"/>
+          <w:szCs w:val="24"/>
+        </w:rPr>
+      </w:pPr>
+    </w:p>
+    <w:p>
+      <w:pPr>
+        <w:jc w:val="center"/>
+        <w:rPr>
+          <w:rFonts w:ascii="Arial" w:hAnsi="Arial" w:cs="Arial"/>
+          <w:sz w:val="28"/>
           <w:szCs w:val="24"/>
         </w:rPr>
       </w:pPr>
@@ -2271,7 +2499,7 @@
           <w:sz w:val="28"/>
           <w:szCs w:val="24"/>
         </w:rPr>
-        <w:t>PROBLEMA</w:t>
+        <w:t>OBJETIVO GERAL</w:t>
       </w:r>
     </w:p>
     <w:p>
@@ -2280,277 +2508,23 @@
         <w:jc w:val="both"/>
         <w:rPr>
           <w:rFonts w:ascii="Arial" w:hAnsi="Arial" w:cs="Arial"/>
-          <w:b/>
-          <w:bCs/>
-          <w:sz w:val="24"/>
-          <w:szCs w:val="24"/>
-        </w:rPr>
-      </w:pPr>
-      <w:r>
-        <w:rPr>
-          <w:rFonts w:ascii="Arial" w:hAnsi="Arial" w:cs="Arial"/>
-          <w:b/>
-          <w:bCs/>
-          <w:sz w:val="24"/>
-          <w:szCs w:val="24"/>
-        </w:rPr>
-        <w:t>Durante o período de observação da rotina escolar da ETEC Professor Camargo Aranha, foi identificado que muitos problemas e sugestões dos alunos não chegam de forma eficiente aos responsáveis pela gestão da escola.</w:t>
-      </w:r>
-    </w:p>
-    <w:p>
-      <w:pPr>
-        <w:ind w:firstLine="708"/>
-        <w:jc w:val="both"/>
-        <w:rPr>
-          <w:rFonts w:ascii="Arial" w:hAnsi="Arial" w:cs="Arial"/>
-          <w:sz w:val="24"/>
-          <w:szCs w:val="24"/>
-        </w:rPr>
-      </w:pPr>
-      <w:r>
-        <w:rPr>
-          <w:rFonts w:ascii="Arial" w:hAnsi="Arial" w:cs="Arial"/>
-          <w:sz w:val="24"/>
-          <w:szCs w:val="24"/>
-        </w:rPr>
-        <w:t>Diversas situações afetam diretamente o cotidiano dos estudantes, tais como:</w:t>
-      </w:r>
-    </w:p>
-    <w:p>
-      <w:pPr>
-        <w:ind w:firstLine="708"/>
-        <w:jc w:val="both"/>
-        <w:rPr>
-          <w:rFonts w:ascii="Arial" w:hAnsi="Arial" w:cs="Arial"/>
-          <w:sz w:val="24"/>
-          <w:szCs w:val="24"/>
-        </w:rPr>
-      </w:pPr>
-      <w:r>
-        <w:rPr>
-          <w:rFonts w:ascii="Arial" w:hAnsi="Arial" w:cs="Arial"/>
-          <w:sz w:val="24"/>
-          <w:szCs w:val="24"/>
-        </w:rPr>
-        <w:t>Falta de cadeiras em salas de aula;</w:t>
-      </w:r>
-    </w:p>
-    <w:p>
-      <w:pPr>
-        <w:ind w:firstLine="708"/>
-        <w:jc w:val="both"/>
-        <w:rPr>
-          <w:rFonts w:ascii="Arial" w:hAnsi="Arial" w:cs="Arial"/>
-          <w:sz w:val="24"/>
-          <w:szCs w:val="24"/>
-        </w:rPr>
-      </w:pPr>
-      <w:r>
-        <w:rPr>
-          <w:rFonts w:ascii="Arial" w:hAnsi="Arial" w:cs="Arial"/>
-          <w:sz w:val="24"/>
-          <w:szCs w:val="24"/>
-        </w:rPr>
-        <w:t>Cadeiras quebradas;</w:t>
-      </w:r>
-    </w:p>
-    <w:p>
-      <w:pPr>
-        <w:ind w:firstLine="708"/>
-        <w:jc w:val="both"/>
-        <w:rPr>
-          <w:rFonts w:ascii="Arial" w:hAnsi="Arial" w:cs="Arial"/>
-          <w:sz w:val="24"/>
-          <w:szCs w:val="24"/>
-        </w:rPr>
-      </w:pPr>
-      <w:r>
-        <w:rPr>
-          <w:rFonts w:ascii="Arial" w:hAnsi="Arial" w:cs="Arial"/>
-          <w:sz w:val="24"/>
-          <w:szCs w:val="24"/>
-        </w:rPr>
-        <w:t>Falta de sabonete nos banheiros;</w:t>
-      </w:r>
-    </w:p>
-    <w:p>
-      <w:pPr>
-        <w:ind w:firstLine="708"/>
-        <w:jc w:val="both"/>
-        <w:rPr>
-          <w:rFonts w:ascii="Arial" w:hAnsi="Arial" w:cs="Arial"/>
-          <w:sz w:val="24"/>
-          <w:szCs w:val="24"/>
-        </w:rPr>
-      </w:pPr>
-      <w:r>
-        <w:rPr>
-          <w:rFonts w:ascii="Arial" w:hAnsi="Arial" w:cs="Arial"/>
-          <w:sz w:val="24"/>
-          <w:szCs w:val="24"/>
-        </w:rPr>
-        <w:t>Ausência de papel higiênico;</w:t>
-      </w:r>
-    </w:p>
-    <w:p>
-      <w:pPr>
-        <w:ind w:firstLine="708"/>
-        <w:jc w:val="both"/>
-        <w:rPr>
-          <w:rFonts w:ascii="Arial" w:hAnsi="Arial" w:cs="Arial"/>
-          <w:sz w:val="24"/>
-          <w:szCs w:val="24"/>
-        </w:rPr>
-      </w:pPr>
-      <w:r>
-        <w:rPr>
-          <w:rFonts w:ascii="Arial" w:hAnsi="Arial" w:cs="Arial"/>
-          <w:sz w:val="24"/>
-          <w:szCs w:val="24"/>
+          <w:sz w:val="24"/>
+        </w:rPr>
+      </w:pPr>
+      <w:r>
+        <w:rPr>
+          <w:rFonts w:ascii="Arial" w:hAnsi="Arial" w:cs="Arial"/>
+          <w:sz w:val="24"/>
+        </w:rPr>
+        <w:t xml:space="preserve">O objetivo geral do projeto Ei Camargo é desenvolver uma plataforma digital que facilite a comunicação entre os alunos da ETEC Professor Camargo Aranha e </w:t>
+      </w:r>
+      <w:r>
+        <w:rPr>
+          <w:rFonts w:ascii="Arial" w:hAnsi="Arial" w:cs="Arial"/>
+          <w:sz w:val="24"/>
         </w:rPr>
         <w:lastRenderedPageBreak/>
-        <w:t>Portas danificadas;</w:t>
-      </w:r>
-    </w:p>
-    <w:p>
-      <w:pPr>
-        <w:ind w:firstLine="708"/>
-        <w:jc w:val="both"/>
-        <w:rPr>
-          <w:rFonts w:ascii="Arial" w:hAnsi="Arial" w:cs="Arial"/>
-          <w:sz w:val="24"/>
-          <w:szCs w:val="24"/>
-        </w:rPr>
-      </w:pPr>
-      <w:r>
-        <w:rPr>
-          <w:rFonts w:ascii="Arial" w:hAnsi="Arial" w:cs="Arial"/>
-          <w:sz w:val="24"/>
-          <w:szCs w:val="24"/>
-        </w:rPr>
-        <w:t>Necessidade de manutenção em ambientes escolares;</w:t>
-      </w:r>
-    </w:p>
-    <w:p>
-      <w:pPr>
-        <w:ind w:firstLine="708"/>
-        <w:jc w:val="both"/>
-        <w:rPr>
-          <w:rFonts w:ascii="Arial" w:hAnsi="Arial" w:cs="Arial"/>
-          <w:sz w:val="24"/>
-          <w:szCs w:val="24"/>
-        </w:rPr>
-      </w:pPr>
-      <w:r>
-        <w:rPr>
-          <w:rFonts w:ascii="Arial" w:hAnsi="Arial" w:cs="Arial"/>
-          <w:sz w:val="24"/>
-          <w:szCs w:val="24"/>
-        </w:rPr>
-        <w:t>Dificuldade para sugerir eventos e melhorias para a comunidade escolar.</w:t>
-      </w:r>
-    </w:p>
-    <w:p>
-      <w:pPr>
-        <w:ind w:firstLine="708"/>
-        <w:jc w:val="both"/>
-        <w:rPr>
-          <w:rFonts w:ascii="Arial" w:hAnsi="Arial" w:cs="Arial"/>
-          <w:sz w:val="24"/>
-          <w:szCs w:val="24"/>
-        </w:rPr>
-      </w:pPr>
-      <w:r>
-        <w:rPr>
-          <w:rFonts w:ascii="Arial" w:hAnsi="Arial" w:cs="Arial"/>
-          <w:sz w:val="24"/>
-          <w:szCs w:val="24"/>
-        </w:rPr>
-        <w:t>Atualmente, muitos desses problemas são comunicados informalmente, o que pode causar atrasos na resolução das demandas ou até mesmo impedir que elas sejam registradas adequadamente.</w:t>
-      </w:r>
-    </w:p>
-    <w:p>
-      <w:pPr>
-        <w:ind w:firstLine="708"/>
-        <w:jc w:val="both"/>
-        <w:rPr>
-          <w:rFonts w:ascii="Arial" w:hAnsi="Arial" w:cs="Arial"/>
-          <w:sz w:val="24"/>
-          <w:szCs w:val="24"/>
-        </w:rPr>
-      </w:pPr>
-      <w:r>
-        <w:rPr>
-          <w:rFonts w:ascii="Arial" w:hAnsi="Arial" w:cs="Arial"/>
-          <w:sz w:val="24"/>
-          <w:szCs w:val="24"/>
-        </w:rPr>
-        <w:t>Além disso, os alunos não possuem um ambiente centralizado para acompanhar comunicados importantes, sugestões enviadas ou informações relacionadas ao seu curso.</w:t>
-      </w:r>
-    </w:p>
-    <w:p>
-      <w:pPr>
-        <w:ind w:firstLine="708"/>
-        <w:jc w:val="both"/>
-        <w:rPr>
-          <w:rFonts w:ascii="Arial" w:hAnsi="Arial" w:cs="Arial"/>
-          <w:sz w:val="24"/>
-          <w:szCs w:val="24"/>
-        </w:rPr>
-      </w:pPr>
-      <w:r>
-        <w:rPr>
-          <w:rFonts w:ascii="Arial" w:hAnsi="Arial" w:cs="Arial"/>
-          <w:sz w:val="24"/>
-          <w:szCs w:val="24"/>
-        </w:rPr>
-        <w:t>Dessa forma, torna-se necessária a criação de uma ferramenta que facilite a comunicação entre alunos e gestão escolar, promovendo maior participação estudantil e contribuindo para a melhoria contínua do ambiente educacional.</w:t>
-      </w:r>
-    </w:p>
-    <w:p>
-      <w:pPr>
-        <w:jc w:val="both"/>
-        <w:rPr>
-          <w:rFonts w:ascii="Arial" w:hAnsi="Arial" w:cs="Arial"/>
-          <w:sz w:val="24"/>
-          <w:szCs w:val="24"/>
-        </w:rPr>
-      </w:pPr>
-    </w:p>
-    <w:p>
-      <w:pPr>
-        <w:jc w:val="center"/>
-        <w:rPr>
-          <w:rFonts w:ascii="Arial" w:hAnsi="Arial" w:cs="Arial"/>
-          <w:sz w:val="28"/>
-          <w:szCs w:val="24"/>
-        </w:rPr>
-      </w:pPr>
-      <w:r>
-        <w:rPr>
-          <w:rFonts w:ascii="Arial" w:hAnsi="Arial" w:cs="Arial"/>
-          <w:b/>
-          <w:sz w:val="28"/>
-          <w:szCs w:val="24"/>
-        </w:rPr>
-        <w:t>OBJETIVO GERAL</w:t>
-      </w:r>
-    </w:p>
-    <w:p>
-      <w:pPr>
-        <w:ind w:firstLine="708"/>
-        <w:jc w:val="both"/>
-        <w:rPr>
-          <w:rFonts w:ascii="Arial" w:hAnsi="Arial" w:cs="Arial"/>
-          <w:sz w:val="24"/>
-        </w:rPr>
-      </w:pPr>
-      <w:r>
-        <w:rPr>
-          <w:rFonts w:ascii="Arial" w:hAnsi="Arial" w:cs="Arial"/>
-          <w:sz w:val="24"/>
-        </w:rPr>
-        <w:t>O objetivo geral do projeto Ei Camargo é desenvolver uma plataforma digital que facilite a comunicação entre os alunos da ETEC Professor Camargo Aranha e seus coordenadores, permitindo o envio de sugestões, reclamações, solicitações de manutenção e propostas de melhoria para a instituição.</w:t>
+        <w:t>seus coordenadores, permitindo o envio de sugestões, reclamações, solicitações de manutenção e propostas de melhoria para a instituição.</w:t>
       </w:r>
     </w:p>
     <w:p>
@@ -3102,6 +3076,7 @@
           <w:sz w:val="24"/>
           <w:szCs w:val="24"/>
         </w:rPr>
+        <w:lastRenderedPageBreak/>
         <w:t xml:space="preserve">          </w:t>
       </w:r>
       <w:r>
@@ -3472,7 +3447,18 @@
           <w:szCs w:val="24"/>
           <w:shd w:val="clear" w:color="auto" w:fill="FFFFFF"/>
         </w:rPr>
-        <w:t xml:space="preserve">              A comunicação escolar é um dos pilares para o bom funcionamento de uma instituição de ensino. Quando existe um fluxo eficiente de informações entre alunos, professores e gestores, torna-se mais fácil identificar problemas, promover melhorias e fortalecer o ambiente educacional.</w:t>
+        <w:t xml:space="preserve">              A comunicação escolar é um dos pilares para o bom funcionamento de uma instituição de ensino. Quando existe um fluxo eficiente de informações entre alunos, </w:t>
+      </w:r>
+      <w:r>
+        <w:rPr>
+          <w:rFonts w:ascii="Arial" w:hAnsi="Arial" w:cs="Arial"/>
+          <w:color w:val="0A0A0A"/>
+          <w:sz w:val="24"/>
+          <w:szCs w:val="24"/>
+          <w:shd w:val="clear" w:color="auto" w:fill="FFFFFF"/>
+        </w:rPr>
+        <w:lastRenderedPageBreak/>
+        <w:t>professores e gestores, torna-se mais fácil identificar problemas, promover melhorias e fortalecer o ambiente educacional.</w:t>
       </w:r>
     </w:p>
     <w:p>
@@ -3876,7 +3862,6 @@
           <w:szCs w:val="24"/>
           <w:lang w:eastAsia="pt-BR"/>
         </w:rPr>
-        <w:lastRenderedPageBreak/>
         <w:t xml:space="preserve">      </w:t>
       </w:r>
       <w:r>
@@ -4018,6 +4003,7 @@
           <w:szCs w:val="24"/>
           <w:lang w:eastAsia="pt-BR"/>
         </w:rPr>
+        <w:lastRenderedPageBreak/>
         <w:drawing>
           <wp:inline distT="0" distB="0" distL="0" distR="0" wp14:anchorId="75AD3B05" wp14:editId="03E2B769">
             <wp:extent cx="3102254" cy="2721610"/>
@@ -4239,6 +4225,7 @@
           <w:sz w:val="24"/>
           <w:szCs w:val="24"/>
         </w:rPr>
+        <w:lastRenderedPageBreak/>
         <w:tab/>
       </w:r>
       <w:r>
@@ -4329,7 +4316,6 @@
           <w:szCs w:val="24"/>
           <w:lang w:eastAsia="pt-BR"/>
         </w:rPr>
-        <w:lastRenderedPageBreak/>
         <w:drawing>
           <wp:inline distT="0" distB="0" distL="0" distR="0" wp14:anchorId="3C9ABAEB" wp14:editId="56BB13ED">
             <wp:extent cx="5555163" cy="2739390"/>
@@ -4383,6 +4369,7 @@
           <w:szCs w:val="24"/>
           <w:lang w:eastAsia="pt-BR"/>
         </w:rPr>
+        <w:lastRenderedPageBreak/>
         <w:drawing>
           <wp:inline distT="0" distB="0" distL="0" distR="0" wp14:anchorId="4879C6C9" wp14:editId="67CC0E74">
             <wp:extent cx="5520010" cy="2732405"/>
@@ -4503,7 +4490,6 @@
           <w:szCs w:val="24"/>
           <w:lang w:eastAsia="pt-BR"/>
         </w:rPr>
-        <w:lastRenderedPageBreak/>
         <w:drawing>
           <wp:inline distT="0" distB="0" distL="0" distR="0" wp14:anchorId="6B4DF2B3" wp14:editId="60053C3E">
             <wp:extent cx="5541934" cy="2750185"/>
@@ -4684,7 +4670,6 @@
           <w:szCs w:val="24"/>
           <w:lang w:eastAsia="pt-BR"/>
         </w:rPr>
-        <w:lastRenderedPageBreak/>
         <w:drawing>
           <wp:inline distT="0" distB="0" distL="0" distR="0" wp14:anchorId="3EA9D48A" wp14:editId="6C441520">
             <wp:extent cx="5555929" cy="2743239"/>
@@ -4933,7 +4918,23 @@
             <w:rStyle w:val="Hyperlink"/>
             <w:rFonts w:ascii="Arial" w:hAnsi="Arial" w:cs="Arial"/>
           </w:rPr>
-          <w:t>://ric.cps.sp.gov.br/handle/123456789/26465</w:t>
+          <w:t>://ric.cps.sp.gov.br/</w:t>
+        </w:r>
+        <w:proofErr w:type="spellStart"/>
+        <w:r>
+          <w:rPr>
+            <w:rStyle w:val="Hyperlink"/>
+            <w:rFonts w:ascii="Arial" w:hAnsi="Arial" w:cs="Arial"/>
+          </w:rPr>
+          <w:t>handle</w:t>
+        </w:r>
+        <w:proofErr w:type="spellEnd"/>
+        <w:r>
+          <w:rPr>
+            <w:rStyle w:val="Hyperlink"/>
+            <w:rFonts w:ascii="Arial" w:hAnsi="Arial" w:cs="Arial"/>
+          </w:rPr>
+          <w:t>/123456789/26465</w:t>
         </w:r>
         <w:r>
           <w:rPr>
@@ -4977,7 +4978,7 @@
 </file>
 
 <file path=word/endnotes.xml><?xml version="1.0" encoding="utf-8"?>
-<w:endnotes xmlns:wpc="http://schemas.microsoft.com/office/word/2010/wordprocessingCanvas" xmlns:cx="http://schemas.microsoft.com/office/drawing/2014/chartex" xmlns:cx1="http://schemas.microsoft.com/office/drawing/2015/9/8/chartex" xmlns:cx2="http://schemas.microsoft.com/office/drawing/2015/10/21/chartex" xmlns:cx3="http://schemas.microsoft.com/office/drawing/2016/5/9/chartex" xmlns:cx4="http://schemas.microsoft.com/office/drawing/2016/5/10/chartex" xmlns:cx5="http://schemas.microsoft.com/office/drawing/2016/5/11/chartex" xmlns:cx6="http://schemas.microsoft.com/office/drawing/2016/5/12/chartex" xmlns:cx7="http://schemas.microsoft.com/office/drawing/2016/5/13/chartex" xmlns:cx8="http://schemas.microsoft.com/office/drawing/2016/5/14/chartex" xmlns:mc="http://schemas.openxmlformats.org/markup-compatibility/2006" xmlns:aink="http://schemas.microsoft.com/office/drawing/2016/ink" xmlns:am3d="http://schemas.microsoft.com/office/drawing/2017/model3d" xmlns:o="urn:schemas-microsoft-com:office:office" xmlns:oel="http://schemas.microsoft.com/office/2019/extlst" xmlns:r="http://schemas.openxmlformats.org/officeDocument/2006/relationships" xmlns:m="http://schemas.openxmlformats.org/officeDocument/2006/math" xmlns:v="urn:schemas-microsoft-com:vml" xmlns:wp14="http://schemas.microsoft.com/office/word/2010/wordprocessingDrawing" xmlns:wp="http://schemas.openxmlformats.org/drawingml/2006/wordprocessingDrawing" xmlns:w10="urn:schemas-microsoft-com:office:word" xmlns:w="http://schemas.openxmlformats.org/wordprocessingml/2006/main" xmlns:w14="http://schemas.microsoft.com/office/word/2010/wordml" xmlns:w15="http://schemas.microsoft.com/office/word/2012/wordml" xmlns:w16cex="http://schemas.microsoft.com/office/word/2018/wordml/cex" xmlns:w16cid="http://schemas.microsoft.com/office/word/2016/wordml/cid" xmlns:w16="http://schemas.microsoft.com/office/word/2018/wordml" xmlns:w16du="http://schemas.microsoft.com/office/word/2023/wordml/word16du" xmlns:w16sdtdh="http://schemas.microsoft.com/office/word/2020/wordml/sdtdatahash" xmlns:w16sdtfl="http://schemas.microsoft.com/office/word/2024/wordml/sdtformatlock" xmlns:w16se="http://schemas.microsoft.com/office/word/2015/wordml/symex" xmlns:wpg="http://schemas.microsoft.com/office/word/2010/wordprocessingGroup" xmlns:wpi="http://schemas.microsoft.com/office/word/2010/wordprocessingInk" xmlns:wne="http://schemas.microsoft.com/office/word/2006/wordml" xmlns:wps="http://schemas.microsoft.com/office/word/2010/wordprocessingShape" mc:Ignorable="w14 w15 w16se w16cid w16 w16cex w16sdtdh w16sdtfl w16du wp14">
+<w:endnotes xmlns:wpc="http://schemas.microsoft.com/office/word/2010/wordprocessingCanvas" xmlns:cx="http://schemas.microsoft.com/office/drawing/2014/chartex" xmlns:cx1="http://schemas.microsoft.com/office/drawing/2015/9/8/chartex" xmlns:cx2="http://schemas.microsoft.com/office/drawing/2015/10/21/chartex" xmlns:cx3="http://schemas.microsoft.com/office/drawing/2016/5/9/chartex" xmlns:cx4="http://schemas.microsoft.com/office/drawing/2016/5/10/chartex" xmlns:cx5="http://schemas.microsoft.com/office/drawing/2016/5/11/chartex" xmlns:cx6="http://schemas.microsoft.com/office/drawing/2016/5/12/chartex" xmlns:cx7="http://schemas.microsoft.com/office/drawing/2016/5/13/chartex" xmlns:cx8="http://schemas.microsoft.com/office/drawing/2016/5/14/chartex" xmlns:mc="http://schemas.openxmlformats.org/markup-compatibility/2006" xmlns:aink="http://schemas.microsoft.com/office/drawing/2016/ink" xmlns:am3d="http://schemas.microsoft.com/office/drawing/2017/model3d" xmlns:o="urn:schemas-microsoft-com:office:office" xmlns:r="http://schemas.openxmlformats.org/officeDocument/2006/relationships" xmlns:m="http://schemas.openxmlformats.org/officeDocument/2006/math" xmlns:v="urn:schemas-microsoft-com:vml" xmlns:wp14="http://schemas.microsoft.com/office/word/2010/wordprocessingDrawing" xmlns:wp="http://schemas.openxmlformats.org/drawingml/2006/wordprocessingDrawing" xmlns:w10="urn:schemas-microsoft-com:office:word" xmlns:w="http://schemas.openxmlformats.org/wordprocessingml/2006/main" xmlns:w14="http://schemas.microsoft.com/office/word/2010/wordml" xmlns:w15="http://schemas.microsoft.com/office/word/2012/wordml" xmlns:w16cid="http://schemas.microsoft.com/office/word/2016/wordml/cid" xmlns:w16se="http://schemas.microsoft.com/office/word/2015/wordml/symex" xmlns:wpg="http://schemas.microsoft.com/office/word/2010/wordprocessingGroup" xmlns:wpi="http://schemas.microsoft.com/office/word/2010/wordprocessingInk" xmlns:wne="http://schemas.microsoft.com/office/word/2006/wordml" xmlns:wps="http://schemas.microsoft.com/office/word/2010/wordprocessingShape" mc:Ignorable="w14 w15 w16se w16cid wp14">
   <w:endnote w:type="separator" w:id="-1">
     <w:p>
       <w:pPr>
@@ -5002,7 +5003,7 @@
 </file>
 
 <file path=word/footnotes.xml><?xml version="1.0" encoding="utf-8"?>
-<w:footnotes xmlns:wpc="http://schemas.microsoft.com/office/word/2010/wordprocessingCanvas" xmlns:cx="http://schemas.microsoft.com/office/drawing/2014/chartex" xmlns:cx1="http://schemas.microsoft.com/office/drawing/2015/9/8/chartex" xmlns:cx2="http://schemas.microsoft.com/office/drawing/2015/10/21/chartex" xmlns:cx3="http://schemas.microsoft.com/office/drawing/2016/5/9/chartex" xmlns:cx4="http://schemas.microsoft.com/office/drawing/2016/5/10/chartex" xmlns:cx5="http://schemas.microsoft.com/office/drawing/2016/5/11/chartex" xmlns:cx6="http://schemas.microsoft.com/office/drawing/2016/5/12/chartex" xmlns:cx7="http://schemas.microsoft.com/office/drawing/2016/5/13/chartex" xmlns:cx8="http://schemas.microsoft.com/office/drawing/2016/5/14/chartex" xmlns:mc="http://schemas.openxmlformats.org/markup-compatibility/2006" xmlns:aink="http://schemas.microsoft.com/office/drawing/2016/ink" xmlns:am3d="http://schemas.microsoft.com/office/drawing/2017/model3d" xmlns:o="urn:schemas-microsoft-com:office:office" xmlns:oel="http://schemas.microsoft.com/office/2019/extlst" xmlns:r="http://schemas.openxmlformats.org/officeDocument/2006/relationships" xmlns:m="http://schemas.openxmlformats.org/officeDocument/2006/math" xmlns:v="urn:schemas-microsoft-com:vml" xmlns:wp14="http://schemas.microsoft.com/office/word/2010/wordprocessingDrawing" xmlns:wp="http://schemas.openxmlformats.org/drawingml/2006/wordprocessingDrawing" xmlns:w10="urn:schemas-microsoft-com:office:word" xmlns:w="http://schemas.openxmlformats.org/wordprocessingml/2006/main" xmlns:w14="http://schemas.microsoft.com/office/word/2010/wordml" xmlns:w15="http://schemas.microsoft.com/office/word/2012/wordml" xmlns:w16cex="http://schemas.microsoft.com/office/word/2018/wordml/cex" xmlns:w16cid="http://schemas.microsoft.com/office/word/2016/wordml/cid" xmlns:w16="http://schemas.microsoft.com/office/word/2018/wordml" xmlns:w16du="http://schemas.microsoft.com/office/word/2023/wordml/word16du" xmlns:w16sdtdh="http://schemas.microsoft.com/office/word/2020/wordml/sdtdatahash" xmlns:w16sdtfl="http://schemas.microsoft.com/office/word/2024/wordml/sdtformatlock" xmlns:w16se="http://schemas.microsoft.com/office/word/2015/wordml/symex" xmlns:wpg="http://schemas.microsoft.com/office/word/2010/wordprocessingGroup" xmlns:wpi="http://schemas.microsoft.com/office/word/2010/wordprocessingInk" xmlns:wne="http://schemas.microsoft.com/office/word/2006/wordml" xmlns:wps="http://schemas.microsoft.com/office/word/2010/wordprocessingShape" mc:Ignorable="w14 w15 w16se w16cid w16 w16cex w16sdtdh w16sdtfl w16du wp14">
+<w:footnotes xmlns:wpc="http://schemas.microsoft.com/office/word/2010/wordprocessingCanvas" xmlns:cx="http://schemas.microsoft.com/office/drawing/2014/chartex" xmlns:cx1="http://schemas.microsoft.com/office/drawing/2015/9/8/chartex" xmlns:cx2="http://schemas.microsoft.com/office/drawing/2015/10/21/chartex" xmlns:cx3="http://schemas.microsoft.com/office/drawing/2016/5/9/chartex" xmlns:cx4="http://schemas.microsoft.com/office/drawing/2016/5/10/chartex" xmlns:cx5="http://schemas.microsoft.com/office/drawing/2016/5/11/chartex" xmlns:cx6="http://schemas.microsoft.com/office/drawing/2016/5/12/chartex" xmlns:cx7="http://schemas.microsoft.com/office/drawing/2016/5/13/chartex" xmlns:cx8="http://schemas.microsoft.com/office/drawing/2016/5/14/chartex" xmlns:mc="http://schemas.openxmlformats.org/markup-compatibility/2006" xmlns:aink="http://schemas.microsoft.com/office/drawing/2016/ink" xmlns:am3d="http://schemas.microsoft.com/office/drawing/2017/model3d" xmlns:o="urn:schemas-microsoft-com:office:office" xmlns:r="http://schemas.openxmlformats.org/officeDocument/2006/relationships" xmlns:m="http://schemas.openxmlformats.org/officeDocument/2006/math" xmlns:v="urn:schemas-microsoft-com:vml" xmlns:wp14="http://schemas.microsoft.com/office/word/2010/wordprocessingDrawing" xmlns:wp="http://schemas.openxmlformats.org/drawingml/2006/wordprocessingDrawing" xmlns:w10="urn:schemas-microsoft-com:office:word" xmlns:w="http://schemas.openxmlformats.org/wordprocessingml/2006/main" xmlns:w14="http://schemas.microsoft.com/office/word/2010/wordml" xmlns:w15="http://schemas.microsoft.com/office/word/2012/wordml" xmlns:w16cid="http://schemas.microsoft.com/office/word/2016/wordml/cid" xmlns:w16se="http://schemas.microsoft.com/office/word/2015/wordml/symex" xmlns:wpg="http://schemas.microsoft.com/office/word/2010/wordprocessingGroup" xmlns:wpi="http://schemas.microsoft.com/office/word/2010/wordprocessingInk" xmlns:wne="http://schemas.microsoft.com/office/word/2006/wordml" xmlns:wps="http://schemas.microsoft.com/office/word/2010/wordprocessingShape" mc:Ignorable="w14 w15 w16se w16cid wp14">
   <w:footnote w:type="separator" w:id="-1">
     <w:p>
       <w:pPr>
@@ -5027,7 +5028,7 @@
 </file>
 
 <file path=word/numbering.xml><?xml version="1.0" encoding="utf-8"?>
-<w:numbering xmlns:wpc="http://schemas.microsoft.com/office/word/2010/wordprocessingCanvas" xmlns:cx="http://schemas.microsoft.com/office/drawing/2014/chartex" xmlns:cx1="http://schemas.microsoft.com/office/drawing/2015/9/8/chartex" xmlns:cx2="http://schemas.microsoft.com/office/drawing/2015/10/21/chartex" xmlns:cx3="http://schemas.microsoft.com/office/drawing/2016/5/9/chartex" xmlns:cx4="http://schemas.microsoft.com/office/drawing/2016/5/10/chartex" xmlns:cx5="http://schemas.microsoft.com/office/drawing/2016/5/11/chartex" xmlns:cx6="http://schemas.microsoft.com/office/drawing/2016/5/12/chartex" xmlns:cx7="http://schemas.microsoft.com/office/drawing/2016/5/13/chartex" xmlns:cx8="http://schemas.microsoft.com/office/drawing/2016/5/14/chartex" xmlns:mc="http://schemas.openxmlformats.org/markup-compatibility/2006" xmlns:aink="http://schemas.microsoft.com/office/drawing/2016/ink" xmlns:am3d="http://schemas.microsoft.com/office/drawing/2017/model3d" xmlns:o="urn:schemas-microsoft-com:office:office" xmlns:oel="http://schemas.microsoft.com/office/2019/extlst" xmlns:r="http://schemas.openxmlformats.org/officeDocument/2006/relationships" xmlns:m="http://schemas.openxmlformats.org/officeDocument/2006/math" xmlns:v="urn:schemas-microsoft-com:vml" xmlns:wp14="http://schemas.microsoft.com/office/word/2010/wordprocessingDrawing" xmlns:wp="http://schemas.openxmlformats.org/drawingml/2006/wordprocessingDrawing" xmlns:w10="urn:schemas-microsoft-com:office:word" xmlns:w="http://schemas.openxmlformats.org/wordprocessingml/2006/main" xmlns:w14="http://schemas.microsoft.com/office/word/2010/wordml" xmlns:w15="http://schemas.microsoft.com/office/word/2012/wordml" xmlns:w16cex="http://schemas.microsoft.com/office/word/2018/wordml/cex" xmlns:w16cid="http://schemas.microsoft.com/office/word/2016/wordml/cid" xmlns:w16="http://schemas.microsoft.com/office/word/2018/wordml" xmlns:w16du="http://schemas.microsoft.com/office/word/2023/wordml/word16du" xmlns:w16sdtdh="http://schemas.microsoft.com/office/word/2020/wordml/sdtdatahash" xmlns:w16sdtfl="http://schemas.microsoft.com/office/word/2024/wordml/sdtformatlock" xmlns:w16se="http://schemas.microsoft.com/office/word/2015/wordml/symex" xmlns:wpg="http://schemas.microsoft.com/office/word/2010/wordprocessingGroup" xmlns:wpi="http://schemas.microsoft.com/office/word/2010/wordprocessingInk" xmlns:wne="http://schemas.microsoft.com/office/word/2006/wordml" xmlns:wps="http://schemas.microsoft.com/office/word/2010/wordprocessingShape" mc:Ignorable="w14 w15 w16se w16cid w16 w16cex w16sdtdh w16sdtfl w16du wp14">
+<w:numbering xmlns:wpc="http://schemas.microsoft.com/office/word/2010/wordprocessingCanvas" xmlns:cx="http://schemas.microsoft.com/office/drawing/2014/chartex" xmlns:cx1="http://schemas.microsoft.com/office/drawing/2015/9/8/chartex" xmlns:cx2="http://schemas.microsoft.com/office/drawing/2015/10/21/chartex" xmlns:cx3="http://schemas.microsoft.com/office/drawing/2016/5/9/chartex" xmlns:cx4="http://schemas.microsoft.com/office/drawing/2016/5/10/chartex" xmlns:cx5="http://schemas.microsoft.com/office/drawing/2016/5/11/chartex" xmlns:cx6="http://schemas.microsoft.com/office/drawing/2016/5/12/chartex" xmlns:cx7="http://schemas.microsoft.com/office/drawing/2016/5/13/chartex" xmlns:cx8="http://schemas.microsoft.com/office/drawing/2016/5/14/chartex" xmlns:mc="http://schemas.openxmlformats.org/markup-compatibility/2006" xmlns:aink="http://schemas.microsoft.com/office/drawing/2016/ink" xmlns:am3d="http://schemas.microsoft.com/office/drawing/2017/model3d" xmlns:o="urn:schemas-microsoft-com:office:office" xmlns:r="http://schemas.openxmlformats.org/officeDocument/2006/relationships" xmlns:m="http://schemas.openxmlformats.org/officeDocument/2006/math" xmlns:v="urn:schemas-microsoft-com:vml" xmlns:wp14="http://schemas.microsoft.com/office/word/2010/wordprocessingDrawing" xmlns:wp="http://schemas.openxmlformats.org/drawingml/2006/wordprocessingDrawing" xmlns:w10="urn:schemas-microsoft-com:office:word" xmlns:w="http://schemas.openxmlformats.org/wordprocessingml/2006/main" xmlns:w14="http://schemas.microsoft.com/office/word/2010/wordml" xmlns:w15="http://schemas.microsoft.com/office/word/2012/wordml" xmlns:w16cid="http://schemas.microsoft.com/office/word/2016/wordml/cid" xmlns:w16se="http://schemas.microsoft.com/office/word/2015/wordml/symex" xmlns:wpg="http://schemas.microsoft.com/office/word/2010/wordprocessingGroup" xmlns:wpi="http://schemas.microsoft.com/office/word/2010/wordprocessingInk" xmlns:wne="http://schemas.microsoft.com/office/word/2006/wordml" xmlns:wps="http://schemas.microsoft.com/office/word/2010/wordprocessingShape" mc:Ignorable="w14 w15 w16se w16cid wp14">
   <w:abstractNum w:abstractNumId="0" w15:restartNumberingAfterBreak="0">
     <w:nsid w:val="03691490"/>
     <w:multiLevelType w:val="multilevel"/>
@@ -8720,104 +8721,104 @@
       </w:rPr>
     </w:lvl>
   </w:abstractNum>
-  <w:num w:numId="1" w16cid:durableId="1721594921">
+  <w:num w:numId="1">
     <w:abstractNumId w:val="3"/>
   </w:num>
-  <w:num w:numId="2" w16cid:durableId="1993440099">
+  <w:num w:numId="2">
     <w:abstractNumId w:val="9"/>
   </w:num>
-  <w:num w:numId="3" w16cid:durableId="323364347">
+  <w:num w:numId="3">
     <w:abstractNumId w:val="15"/>
   </w:num>
-  <w:num w:numId="4" w16cid:durableId="398214983">
+  <w:num w:numId="4">
     <w:abstractNumId w:val="19"/>
   </w:num>
-  <w:num w:numId="5" w16cid:durableId="448162349">
+  <w:num w:numId="5">
     <w:abstractNumId w:val="4"/>
   </w:num>
-  <w:num w:numId="6" w16cid:durableId="1494024326">
+  <w:num w:numId="6">
     <w:abstractNumId w:val="20"/>
   </w:num>
-  <w:num w:numId="7" w16cid:durableId="23333480">
+  <w:num w:numId="7">
     <w:abstractNumId w:val="17"/>
   </w:num>
-  <w:num w:numId="8" w16cid:durableId="112528278">
+  <w:num w:numId="8">
     <w:abstractNumId w:val="13"/>
   </w:num>
-  <w:num w:numId="9" w16cid:durableId="760875548">
+  <w:num w:numId="9">
     <w:abstractNumId w:val="30"/>
   </w:num>
-  <w:num w:numId="10" w16cid:durableId="646789287">
+  <w:num w:numId="10">
     <w:abstractNumId w:val="25"/>
   </w:num>
-  <w:num w:numId="11" w16cid:durableId="509837042">
+  <w:num w:numId="11">
     <w:abstractNumId w:val="22"/>
   </w:num>
-  <w:num w:numId="12" w16cid:durableId="639572464">
+  <w:num w:numId="12">
     <w:abstractNumId w:val="10"/>
   </w:num>
-  <w:num w:numId="13" w16cid:durableId="982081786">
+  <w:num w:numId="13">
     <w:abstractNumId w:val="12"/>
   </w:num>
-  <w:num w:numId="14" w16cid:durableId="1444617469">
+  <w:num w:numId="14">
     <w:abstractNumId w:val="24"/>
   </w:num>
-  <w:num w:numId="15" w16cid:durableId="2083748788">
+  <w:num w:numId="15">
     <w:abstractNumId w:val="1"/>
   </w:num>
-  <w:num w:numId="16" w16cid:durableId="1437677601">
+  <w:num w:numId="16">
     <w:abstractNumId w:val="27"/>
   </w:num>
-  <w:num w:numId="17" w16cid:durableId="7145012">
+  <w:num w:numId="17">
     <w:abstractNumId w:val="7"/>
   </w:num>
-  <w:num w:numId="18" w16cid:durableId="411196190">
+  <w:num w:numId="18">
     <w:abstractNumId w:val="28"/>
   </w:num>
-  <w:num w:numId="19" w16cid:durableId="434642736">
+  <w:num w:numId="19">
     <w:abstractNumId w:val="14"/>
   </w:num>
-  <w:num w:numId="20" w16cid:durableId="1436556457">
+  <w:num w:numId="20">
     <w:abstractNumId w:val="8"/>
   </w:num>
-  <w:num w:numId="21" w16cid:durableId="1588534698">
+  <w:num w:numId="21">
     <w:abstractNumId w:val="23"/>
   </w:num>
-  <w:num w:numId="22" w16cid:durableId="1492873035">
+  <w:num w:numId="22">
     <w:abstractNumId w:val="26"/>
   </w:num>
-  <w:num w:numId="23" w16cid:durableId="1043597172">
+  <w:num w:numId="23">
     <w:abstractNumId w:val="18"/>
   </w:num>
-  <w:num w:numId="24" w16cid:durableId="1980185154">
+  <w:num w:numId="24">
     <w:abstractNumId w:val="21"/>
   </w:num>
-  <w:num w:numId="25" w16cid:durableId="1041789231">
+  <w:num w:numId="25">
     <w:abstractNumId w:val="29"/>
   </w:num>
-  <w:num w:numId="26" w16cid:durableId="1554073723">
+  <w:num w:numId="26">
     <w:abstractNumId w:val="6"/>
   </w:num>
-  <w:num w:numId="27" w16cid:durableId="954948479">
+  <w:num w:numId="27">
     <w:abstractNumId w:val="0"/>
   </w:num>
-  <w:num w:numId="28" w16cid:durableId="445199118">
+  <w:num w:numId="28">
     <w:abstractNumId w:val="5"/>
   </w:num>
-  <w:num w:numId="29" w16cid:durableId="1388996554">
+  <w:num w:numId="29">
     <w:abstractNumId w:val="11"/>
   </w:num>
-  <w:num w:numId="30" w16cid:durableId="541748589">
+  <w:num w:numId="30">
     <w:abstractNumId w:val="16"/>
   </w:num>
-  <w:num w:numId="31" w16cid:durableId="798034843">
+  <w:num w:numId="31">
     <w:abstractNumId w:val="2"/>
   </w:num>
 </w:numbering>
 </file>
 
 <file path=word/styles.xml><?xml version="1.0" encoding="utf-8"?>
-<w:styles xmlns:mc="http://schemas.openxmlformats.org/markup-compatibility/2006" xmlns:r="http://schemas.openxmlformats.org/officeDocument/2006/relationships" xmlns:w="http://schemas.openxmlformats.org/wordprocessingml/2006/main" xmlns:w14="http://schemas.microsoft.com/office/word/2010/wordml" xmlns:w15="http://schemas.microsoft.com/office/word/2012/wordml" xmlns:w16cex="http://schemas.microsoft.com/office/word/2018/wordml/cex" xmlns:w16cid="http://schemas.microsoft.com/office/word/2016/wordml/cid" xmlns:w16="http://schemas.microsoft.com/office/word/2018/wordml" xmlns:w16du="http://schemas.microsoft.com/office/word/2023/wordml/word16du" xmlns:w16sdtdh="http://schemas.microsoft.com/office/word/2020/wordml/sdtdatahash" xmlns:w16sdtfl="http://schemas.microsoft.com/office/word/2024/wordml/sdtformatlock" xmlns:w16se="http://schemas.microsoft.com/office/word/2015/wordml/symex" mc:Ignorable="w14 w15 w16se w16cid w16 w16cex w16sdtdh w16sdtfl w16du">
+<w:styles xmlns:mc="http://schemas.openxmlformats.org/markup-compatibility/2006" xmlns:r="http://schemas.openxmlformats.org/officeDocument/2006/relationships" xmlns:w="http://schemas.openxmlformats.org/wordprocessingml/2006/main" xmlns:w14="http://schemas.microsoft.com/office/word/2010/wordml" xmlns:w15="http://schemas.microsoft.com/office/word/2012/wordml" xmlns:w16cid="http://schemas.microsoft.com/office/word/2016/wordml/cid" xmlns:w16se="http://schemas.microsoft.com/office/word/2015/wordml/symex" mc:Ignorable="w14 w15 w16se w16cid">
   <w:docDefaults>
     <w:rPrDefault>
       <w:rPr>
@@ -8833,7 +8834,7 @@
       </w:pPr>
     </w:pPrDefault>
   </w:docDefaults>
-  <w:latentStyles w:defLockedState="0" w:defUIPriority="99" w:defSemiHidden="0" w:defUnhideWhenUsed="0" w:defQFormat="0" w:count="376">
+  <w:latentStyles w:defLockedState="0" w:defUIPriority="99" w:defSemiHidden="0" w:defUnhideWhenUsed="0" w:defQFormat="0" w:count="375">
     <w:lsdException w:name="Normal" w:uiPriority="0" w:qFormat="1"/>
     <w:lsdException w:name="heading 1" w:uiPriority="9" w:qFormat="1"/>
     <w:lsdException w:name="heading 2" w:semiHidden="1" w:uiPriority="9" w:unhideWhenUsed="1" w:qFormat="1"/>
@@ -9209,7 +9210,6 @@
     <w:lsdException w:name="Smart Hyperlink" w:semiHidden="1" w:unhideWhenUsed="1"/>
     <w:lsdException w:name="Hashtag" w:semiHidden="1" w:unhideWhenUsed="1"/>
     <w:lsdException w:name="Unresolved Mention" w:semiHidden="1" w:unhideWhenUsed="1"/>
-    <w:lsdException w:name="Smart Link" w:semiHidden="1" w:unhideWhenUsed="1"/>
   </w:latentStyles>
   <w:style w:type="paragraph" w:default="1" w:styleId="Normal">
     <w:name w:val="Normal"/>
@@ -9581,6 +9581,23 @@
       <w:shd w:val="clear" w:color="auto" w:fill="E1DFDD"/>
     </w:rPr>
   </w:style>
+  <w:style w:type="paragraph" w:styleId="NormalWeb">
+    <w:name w:val="Normal (Web)"/>
+    <w:basedOn w:val="Normal"/>
+    <w:uiPriority w:val="99"/>
+    <w:semiHidden/>
+    <w:unhideWhenUsed/>
+    <w:rsid w:val="00267061"/>
+    <w:pPr>
+      <w:spacing w:before="100" w:beforeAutospacing="1" w:after="100" w:afterAutospacing="1" w:line="240" w:lineRule="auto"/>
+    </w:pPr>
+    <w:rPr>
+      <w:rFonts w:ascii="Times New Roman" w:eastAsia="Times New Roman" w:hAnsi="Times New Roman" w:cs="Times New Roman"/>
+      <w:sz w:val="24"/>
+      <w:szCs w:val="24"/>
+      <w:lang w:eastAsia="pt-BR"/>
+    </w:rPr>
+  </w:style>
 </w:styles>
 </file>
 
@@ -9884,10 +9901,9 @@
 </file>
 
 <file path=customXml/itemProps1.xml><?xml version="1.0" encoding="utf-8"?>
-<ds:datastoreItem xmlns:ds="http://schemas.openxmlformats.org/officeDocument/2006/customXml" ds:itemID="{3E1DC03E-2D50-4B3D-A73F-019C24C3C08F}">
+<ds:datastoreItem xmlns:ds="http://schemas.openxmlformats.org/officeDocument/2006/customXml" ds:itemID="{6E8657F9-CF85-46FF-8BF2-DA5A850E2CF3}">
   <ds:schemaRefs>
     <ds:schemaRef ds:uri="http://schemas.openxmlformats.org/officeDocument/2006/bibliography"/>
-    <ds:schemaRef ds:uri="http://www.w3.org/2000/xmlns/"/>
   </ds:schemaRefs>
 </ds:datastoreItem>
 </file>
</xml_diff>